<commit_message>
feat(session): rows by session with the state in the last cell of any table
applySessionRows(block) (session.js, called first by applyBlockOptions):
a row whose LAST cell is only states (| Title | Hola | signed-in |, any
number of values) stays only for those states; the state cell is removed so
blocks read their table unchanged (row.dataset.session keeps it). Empty
last cell, key | value rows or non-state text: always shown. A page with
such rows reloads when the session changes, unless navigateTo() already
started a navigation (login, page guard, private 401).
block-session-example Items use the new format (Item | text | state);
ejemplo-sesion.docx, README, 08-sesiones.md and foundations README updated.

Co-Authored-By: Claude Opus 5.5 (1M context) <noreply@anthropic.com>
</commit_message>
<xml_diff>
--- a/content-drive/ejemplo-sesion.docx
+++ b/content-drive/ejemplo-sesion.docx
@@ -222,17 +222,49 @@
           </w:tcPr>
           <w:p>
             <w:r>
+              <w:t xml:space="preserve">Inicia sesión para ver tus cupones.</w:t>
+            </w:r>
+          </w:p>
+        </w:tc>
+        <w:tc>
+          <w:tcPr>
+            <w:tcW w:w="3600" w:type="dxa"/>
+          </w:tcPr>
+          <w:p>
+            <w:r>
               <w:t xml:space="preserve">signed-out</w:t>
             </w:r>
           </w:p>
         </w:tc>
+      </w:tr>
+      <w:tr>
+        <w:tc>
+          <w:tcPr>
+            <w:tcW w:w="2160" w:type="dxa"/>
+          </w:tcPr>
+          <w:p>
+            <w:r>
+              <w:t xml:space="preserve">Item</w:t>
+            </w:r>
+          </w:p>
+        </w:tc>
         <w:tc>
           <w:tcPr>
             <w:tcW w:w="3600" w:type="dxa"/>
           </w:tcPr>
           <w:p>
             <w:r>
-              <w:t xml:space="preserve">Inicia sesión para ver tus cupones.</w:t>
+              <w:t xml:space="preserve">Tienes 2 cupones disponibles.</w:t>
+            </w:r>
+          </w:p>
+        </w:tc>
+        <w:tc>
+          <w:tcPr>
+            <w:tcW w:w="3600" w:type="dxa"/>
+          </w:tcPr>
+          <w:p>
+            <w:r>
+              <w:t xml:space="preserve">signed-in</w:t>
             </w:r>
           </w:p>
         </w:tc>
@@ -254,7 +286,7 @@
           </w:tcPr>
           <w:p>
             <w:r>
-              <w:t xml:space="preserve">signed-in</w:t>
+              <w:t xml:space="preserve">Crea una cuenta para guardar tu compra.</w:t>
             </w:r>
           </w:p>
         </w:tc>
@@ -264,7 +296,7 @@
           </w:tcPr>
           <w:p>
             <w:r>
-              <w:t xml:space="preserve">Tienes 2 cupones disponibles.</w:t>
+              <w:t xml:space="preserve">guest</w:t>
             </w:r>
           </w:p>
         </w:tc>
@@ -286,7 +318,7 @@
           </w:tcPr>
           <w:p>
             <w:r>
-              <w:t xml:space="preserve">guest</w:t>
+              <w:t xml:space="preserve">Tu carrito se guarda en esta visita.</w:t>
             </w:r>
           </w:p>
         </w:tc>
@@ -296,7 +328,7 @@
           </w:tcPr>
           <w:p>
             <w:r>
-              <w:t xml:space="preserve">Crea una cuenta para guardar tu compra.</w:t>
+              <w:t xml:space="preserve">signed-in, guest</w:t>
             </w:r>
           </w:p>
         </w:tc>
@@ -314,45 +346,8 @@
         </w:tc>
         <w:tc>
           <w:tcPr>
-            <w:tcW w:w="3600" w:type="dxa"/>
-          </w:tcPr>
-          <w:p>
-            <w:r>
-              <w:t xml:space="preserve">signed-in, guest</w:t>
-            </w:r>
-          </w:p>
-        </w:tc>
-        <w:tc>
-          <w:tcPr>
-            <w:tcW w:w="3600" w:type="dxa"/>
-          </w:tcPr>
-          <w:p>
-            <w:r>
-              <w:t xml:space="preserve">Tu carrito se guarda en esta visita.</w:t>
-            </w:r>
-          </w:p>
-        </w:tc>
-      </w:tr>
-      <w:tr>
-        <w:tc>
-          <w:tcPr>
-            <w:tcW w:w="2160" w:type="dxa"/>
-          </w:tcPr>
-          <w:p>
-            <w:r>
-              <w:t xml:space="preserve">Item</w:t>
-            </w:r>
-          </w:p>
-        </w:tc>
-        <w:tc>
-          <w:tcPr>
-            <w:tcW w:w="3600" w:type="dxa"/>
-          </w:tcPr>
-          <w:p/>
-        </w:tc>
-        <w:tc>
-          <w:tcPr>
-            <w:tcW w:w="3600" w:type="dxa"/>
+            <w:tcW w:w="7200" w:type="dxa"/>
+            <w:gridSpan w:val="2"/>
           </w:tcPr>
           <w:p>
             <w:r>
@@ -500,14 +495,13 @@
       </w:tblPr>
       <w:tblGrid>
         <w:gridCol w:w="2160"/>
-        <w:gridCol w:w="3600"/>
-        <w:gridCol w:w="3600"/>
+        <w:gridCol w:w="7200"/>
       </w:tblGrid>
       <w:tr>
         <w:tc>
           <w:tcPr>
             <w:tcW w:w="9360" w:type="dxa"/>
-            <w:gridSpan w:val="3"/>
+            <w:gridSpan w:val="2"/>
           </w:tcPr>
           <w:p>
             <w:r>
@@ -530,7 +524,6 @@
         <w:tc>
           <w:tcPr>
             <w:tcW w:w="7200" w:type="dxa"/>
-            <w:gridSpan w:val="2"/>
           </w:tcPr>
           <w:p/>
         </w:tc>
@@ -549,7 +542,6 @@
         <w:tc>
           <w:tcPr>
             <w:tcW w:w="7200" w:type="dxa"/>
-            <w:gridSpan w:val="2"/>
           </w:tcPr>
           <w:p/>
         </w:tc>
@@ -568,7 +560,6 @@
         <w:tc>
           <w:tcPr>
             <w:tcW w:w="7200" w:type="dxa"/>
-            <w:gridSpan w:val="2"/>
           </w:tcPr>
           <w:p>
             <w:r>
@@ -591,7 +582,6 @@
         <w:tc>
           <w:tcPr>
             <w:tcW w:w="7200" w:type="dxa"/>
-            <w:gridSpan w:val="2"/>
           </w:tcPr>
           <w:p>
             <w:r>
@@ -614,7 +604,6 @@
         <w:tc>
           <w:tcPr>
             <w:tcW w:w="7200" w:type="dxa"/>
-            <w:gridSpan w:val="2"/>
           </w:tcPr>
           <w:p>
             <w:r>
@@ -636,13 +625,7 @@
         </w:tc>
         <w:tc>
           <w:tcPr>
-            <w:tcW w:w="3600" w:type="dxa"/>
-          </w:tcPr>
-          <w:p/>
-        </w:tc>
-        <w:tc>
-          <w:tcPr>
-            <w:tcW w:w="3600" w:type="dxa"/>
+            <w:tcW w:w="7200" w:type="dxa"/>
           </w:tcPr>
           <w:p>
             <w:r>

</xml_diff>

<commit_message>
feat(session): block Session row true | false | empty
The Session row of any block (applyBlockOptions) now only says whether there
is a session (a guest counts as no session):
  true  → the whole block (and wrapper) only WITH a session
  false → only WITHOUT a session (e.g. an "Iniciar sesión" call to action)
  empty or no row → always shown
ejemplo-sesion.docx uses true and false; guides 06/08 and the example
README updated.

Co-Authored-By: Claude Opus 5.5 (1M context) <noreply@anthropic.com>
</commit_message>
<xml_diff>
--- a/content-drive/ejemplo-sesion.docx
+++ b/content-drive/ejemplo-sesion.docx
@@ -563,7 +563,7 @@
           </w:tcPr>
           <w:p>
             <w:r>
-              <w:t xml:space="preserve">signed-in</w:t>
+              <w:t xml:space="preserve">true</w:t>
             </w:r>
           </w:p>
         </w:tc>
@@ -724,7 +724,7 @@
           </w:tcPr>
           <w:p>
             <w:r>
-              <w:t xml:space="preserve">signed-out</w:t>
+              <w:t xml:space="preserve">false</w:t>
             </w:r>
           </w:p>
         </w:tc>
@@ -768,7 +768,29 @@
           </w:tcPr>
           <w:p>
             <w:r>
-              <w:t xml:space="preserve">Este bloque entero se oculta cuando inicias sesión o entras como invitado.</w:t>
+              <w:t xml:space="preserve">Este bloque entero se oculta cuando inicias sesión.</w:t>
+            </w:r>
+          </w:p>
+        </w:tc>
+      </w:tr>
+      <w:tr>
+        <w:tc>
+          <w:tcPr>
+            <w:tcW w:w="2160" w:type="dxa"/>
+          </w:tcPr>
+          <w:p>
+            <w:r>
+              <w:t xml:space="preserve">Guest Text</w:t>
+            </w:r>
+          </w:p>
+        </w:tc>
+        <w:tc>
+          <w:tcPr>
+            <w:tcW w:w="7200" w:type="dxa"/>
+          </w:tcPr>
+          <w:p>
+            <w:r>
+              <w:t xml:space="preserve">Como invitado no tienes sesión: este bloque se sigue viendo.</w:t>
             </w:r>
           </w:p>
         </w:tc>

</xml_diff>

<commit_message>
feat(session): guest session profile and user data card in the session example
- session.js: continueAsGuest() stores a guest session with the same shape as a real one
  (GUEST_USER, own sessionId, no token); getGuestSession(), getCurrentSession(),
  getCurrentUser(); renderBySessionState views get the current session (real or guest)
- block-session-example: "Tus datos" card (User Title row) for signed-in and guest visitors,
  hidden without a session, never the token
- Drive document of the example with the User Title row; READMEs and sessions guide updated

Co-Authored-By: Claude Opus 5.5 (1M context) <noreply@anthropic.com>
</commit_message>
<xml_diff>
--- a/content-drive/ejemplo-sesion.docx
+++ b/content-drive/ejemplo-sesion.docx
@@ -427,6 +427,29 @@
           <w:p>
             <w:r>
               <w:t xml:space="preserve">Cerrar sesión</w:t>
+            </w:r>
+          </w:p>
+        </w:tc>
+      </w:tr>
+      <w:tr>
+        <w:tc>
+          <w:tcPr>
+            <w:tcW w:w="2160" w:type="dxa"/>
+          </w:tcPr>
+          <w:p>
+            <w:r>
+              <w:t xml:space="preserve">User Title</w:t>
+            </w:r>
+          </w:p>
+        </w:tc>
+        <w:tc>
+          <w:tcPr>
+            <w:tcW w:w="7200" w:type="dxa"/>
+            <w:gridSpan w:val="2"/>
+          </w:tcPr>
+          <w:p>
+            <w:r>
+              <w:t xml:space="preserve">Tus datos</w:t>
             </w:r>
           </w:p>
         </w:tc>

</xml_diff>

<commit_message>
feat(store): user of the session in the store, {store.…} marks in Drive
- store.js: slice user (userId, firstName, lastName, fullName, email, phone, verified,
  sessionId, isGuest; never the token); only marks {store.slice.variable} are filled,
  block marks like {id} / {count} are never touched
- session.js fills store user on every page start, login, guest, logout and expiry
  (syncUserStore); getSessionData() no longer returns user / fields
- account-profile and block-session-example read the user from the store
- Drive documents: detail {store.breadcrumb.name}, session example {store.user.firstName}
- READMEs and sessions guide updated

Co-Authored-By: Claude Opus 5.5 (1M context) <noreply@anthropic.com>
</commit_message>
<xml_diff>
--- a/content-drive/ejemplo-sesion.docx
+++ b/content-drive/ejemplo-sesion.docx
@@ -154,7 +154,7 @@
           </w:tcPr>
           <w:p>
             <w:r>
-              <w:t xml:space="preserve">Hola, {name}. Tienes una sesión activa.</w:t>
+              <w:t xml:space="preserve">Hola, {store.user.firstName}. Tienes una sesión activa.</w:t>
             </w:r>
           </w:p>
         </w:tc>
@@ -630,7 +630,7 @@
           </w:tcPr>
           <w:p>
             <w:r>
-              <w:t xml:space="preserve">Este bloque entero solo se ve si iniciaste sesión, {name}.</w:t>
+              <w:t xml:space="preserve">Este bloque entero solo se ve si iniciaste sesión, {store.user.firstName}.</w:t>
             </w:r>
           </w:p>
         </w:tc>

</xml_diff>

<commit_message>
feat(store): session state and token in the store, login/logout/guest in Drive
- store: new "session" slice { isSession (login only), isGuest, token }, filled
  only by session.js; private variables (session.token) are never filled by marks
- block-options: the Session row reads store session.isSession (session-hidden
  class, visible in the editing tool preview); last-column rows moved here and
  read store "session", reload via store.subscribe
- Drive last column: login / logout / guest (signed-in / signed-out still accepted)
- interceptors: Authorization header from store session.token;
  getAuthorizationHeader removed
- session example Drive document and docs updated

Co-Authored-By: Claude Opus 5.5 (1M context) <noreply@anthropic.com>
</commit_message>
<xml_diff>
--- a/content-drive/ejemplo-sesion.docx
+++ b/content-drive/ejemplo-sesion.docx
@@ -232,7 +232,7 @@
           </w:tcPr>
           <w:p>
             <w:r>
-              <w:t xml:space="preserve">signed-out</w:t>
+              <w:t xml:space="preserve">logout</w:t>
             </w:r>
           </w:p>
         </w:tc>
@@ -264,7 +264,7 @@
           </w:tcPr>
           <w:p>
             <w:r>
-              <w:t xml:space="preserve">signed-in</w:t>
+              <w:t xml:space="preserve">login</w:t>
             </w:r>
           </w:p>
         </w:tc>
@@ -328,7 +328,7 @@
           </w:tcPr>
           <w:p>
             <w:r>
-              <w:t xml:space="preserve">signed-in, guest</w:t>
+              <w:t xml:space="preserve">login, guest</w:t>
             </w:r>
           </w:p>
         </w:tc>

</xml_diff>